<commit_message>
Align the system introduction with the manual and deck
Backend test count is now 498, the data date is 10/13, and the future
work item states the break-even result already computed in the manual
and presentation instead of promising to compute it.

Co-Authored-By: Claude Opus 5.5 <noreply@anthropic.com>
</commit_message>
<xml_diff>
--- a/docs/四技第115405組-MeBOD醫美時尚輿情分析系統-系統簡介.docx
+++ b/docs/四技第115405組-MeBOD醫美時尚輿情分析系統-系統簡介.docx
@@ -997,7 +997,7 @@
           <w:sz w:val="24"/>
           <w:szCs w:val="24"/>
         </w:rPr>
-        <w:t xml:space="preserve">關鍵字、預警與歷史依帳號保存，不必每次重新下指令；後端 490 項、前端 43 項自動化測試通過。</w:t>
+        <w:t xml:space="preserve">關鍵字、預警與歷史依帳號保存，不必每次重新下指令；後端 498 項、前端 43 項自動化測試通過。</w:t>
       </w:r>
     </w:p>
     <w:tbl>
@@ -1901,7 +1901,7 @@
           <w:sz w:val="24"/>
           <w:szCs w:val="24"/>
         </w:rPr>
-        <w:t xml:space="preserve">MeBOD 已完成從蒐集、判讀、檢索到報告的完整流程，截至 115 年 10 月 9 日收錄 10,370 篇文章、6,364 則留言。未來發展：</w:t>
+        <w:t xml:space="preserve">MeBOD 已完成從蒐集、判讀、檢索到報告的完整流程，截至 115 年 10 月 13 日收錄 10,370 篇文章、6,364 則留言。未來發展：</w:t>
       </w:r>
     </w:p>
     <w:p>
@@ -1935,7 +1935,7 @@
           <w:sz w:val="24"/>
           <w:szCs w:val="24"/>
         </w:rPr>
-        <w:t xml:space="preserve">以試用回饋確認方案定價，量化主機、資料庫與 Gemini API 費用，計算損益兩平的付費帳號數。</w:t>
+        <w:t xml:space="preserve">以實測試算，專業版（月費 490 元，假設值）4 個付費帳號可打平每月約 1,450 元雲端支出，計入維運人力需 12～21 個；將以試用回饋與實際帳單校正。</w:t>
       </w:r>
     </w:p>
     <w:p>

</xml_diff>